<commit_message>
ajustes em relatório para coparar meses
</commit_message>
<xml_diff>
--- a/saida_relatorio/Relatorio_Sistemas.docx
+++ b/saida_relatorio/Relatorio_Sistemas.docx
@@ -46,10 +46,62 @@
           <w:color w:val="595959"/>
           <w:sz w:val="18"/>
         </w:rPr>
-        <w:t>Redigido por David Vieira · Gerado automaticamente em 09/09/2026 20:44</w:t>
+        <w:t>Redigido por David Vieira · Gerado automaticamente em 16/09/2026 21:48</w:t>
       </w:r>
     </w:p>
     <w:p/>
+    <w:p>
+      <w:pPr>
+        <w:pStyle w:val="Heading1"/>
+      </w:pPr>
+      <w:r>
+        <w:rPr>
+          <w:color w:val="1F3864"/>
+          <w:sz w:val="32"/>
+        </w:rPr>
+        <w:t>Visão Histórica</w:t>
+      </w:r>
+    </w:p>
+    <w:p>
+      <w:r>
+        <w:rPr>
+          <w:b w:val="0"/>
+          <w:i w:val="0"/>
+          <w:sz w:val="21"/>
+        </w:rPr>
+        <w:t>Período atual: 2026-08 — 141 chamados, 121 resolvidos e taxa de resolução de 85.8%.</w:t>
+      </w:r>
+    </w:p>
+    <w:p>
+      <w:r>
+        <w:rPr>
+          <w:i/>
+          <w:color w:val="595959"/>
+          <w:sz w:val="19"/>
+        </w:rPr>
+        <w:t>Ainda não há outro período histórico disponível para comparação.</w:t>
+      </w:r>
+    </w:p>
+    <w:p>
+      <w:r>
+        <w:rPr>
+          <w:i/>
+          <w:color w:val="595959"/>
+          <w:sz w:val="19"/>
+        </w:rPr>
+        <w:t>A tendência será exibida quando houver pelo menos três meses históricos.</w:t>
+      </w:r>
+    </w:p>
+    <w:p>
+      <w:r>
+        <w:rPr>
+          <w:i/>
+          <w:color w:val="595959"/>
+          <w:sz w:val="19"/>
+        </w:rPr>
+        <w:t>A projeção será exibida quando houver pelo menos três meses históricos.</w:t>
+      </w:r>
+    </w:p>
     <w:p>
       <w:pPr>
         <w:pStyle w:val="Heading1"/>
@@ -3121,7 +3173,7 @@
                 <w:b w:val="0"/>
                 <w:sz w:val="19"/>
               </w:rPr>
-              <w:t>898.7</w:t>
+              <w:t>1067.8</w:t>
             </w:r>
           </w:p>
         </w:tc>
@@ -3359,7 +3411,7 @@
                 <w:b w:val="0"/>
                 <w:sz w:val="19"/>
               </w:rPr>
-              <w:t>871.0</w:t>
+              <w:t>1040.0</w:t>
             </w:r>
           </w:p>
         </w:tc>
@@ -3481,7 +3533,7 @@
                 <w:b w:val="0"/>
                 <w:sz w:val="19"/>
               </w:rPr>
-              <w:t>869.6</w:t>
+              <w:t>1038.6</w:t>
             </w:r>
           </w:p>
         </w:tc>
@@ -3597,7 +3649,7 @@
                 <w:b w:val="0"/>
                 <w:sz w:val="19"/>
               </w:rPr>
-              <w:t>869.2</w:t>
+              <w:t>1038.3</w:t>
             </w:r>
           </w:p>
         </w:tc>
@@ -3719,7 +3771,7 @@
                 <w:b w:val="0"/>
                 <w:sz w:val="19"/>
               </w:rPr>
-              <w:t>824.6</w:t>
+              <w:t>993.7</w:t>
             </w:r>
           </w:p>
         </w:tc>
@@ -3835,7 +3887,7 @@
                 <w:b w:val="0"/>
                 <w:sz w:val="19"/>
               </w:rPr>
-              <w:t>821.7</w:t>
+              <w:t>990.8</w:t>
             </w:r>
           </w:p>
         </w:tc>
@@ -3957,7 +4009,7 @@
                 <w:b w:val="0"/>
                 <w:sz w:val="19"/>
               </w:rPr>
-              <w:t>731.1</w:t>
+              <w:t>900.1</w:t>
             </w:r>
           </w:p>
         </w:tc>
@@ -4073,7 +4125,7 @@
                 <w:b w:val="0"/>
                 <w:sz w:val="19"/>
               </w:rPr>
-              <w:t>706.1</w:t>
+              <w:t>875.1</w:t>
             </w:r>
           </w:p>
         </w:tc>
@@ -4195,7 +4247,7 @@
                 <w:b w:val="0"/>
                 <w:sz w:val="19"/>
               </w:rPr>
-              <w:t>485.2</w:t>
+              <w:t>654.3</w:t>
             </w:r>
           </w:p>
         </w:tc>
@@ -4311,7 +4363,7 @@
                 <w:b w:val="0"/>
                 <w:sz w:val="19"/>
               </w:rPr>
-              <w:t>298.6</w:t>
+              <w:t>467.6</w:t>
             </w:r>
           </w:p>
         </w:tc>
@@ -4433,7 +4485,7 @@
                 <w:b w:val="0"/>
                 <w:sz w:val="19"/>
               </w:rPr>
-              <w:t>295.1</w:t>
+              <w:t>464.1</w:t>
             </w:r>
           </w:p>
         </w:tc>
@@ -4545,7 +4597,7 @@
                 <w:b w:val="0"/>
                 <w:sz w:val="19"/>
               </w:rPr>
-              <w:t>8.051.5</w:t>
+              <w:t>9.911.3</w:t>
             </w:r>
           </w:p>
         </w:tc>

</xml_diff>